<commit_message>
Spelling: Herschel -> Henschel in June 19 AIO+luxury draft
</commit_message>
<xml_diff>
--- a/_drafts/2026-06-19_how-memorial-houston-buyers-use-the-allinone-loan-on-luxury/review.docx
+++ b/_drafts/2026-06-19_how-memorial-houston-buyers-use-the-allinone-loan-on-luxury/review.docx
@@ -231,7 +231,7 @@
     </w:p>
     <w:p>
       <w:r>
-        <w:t>The underwriting process for luxury properties is thorough. Lenders like Tyler Herschel at CMG Home Loans evaluate several factors:</w:t>
+        <w:t>The underwriting process for luxury properties is thorough. Lenders like Tyler Henschel at CMG Home Loans evaluate several factors:</w:t>
       </w:r>
     </w:p>
     <w:p>
@@ -367,12 +367,12 @@
         <w:pStyle w:val="Heading2"/>
       </w:pPr>
       <w:r>
-        <w:t>Work With Tyler Herschel on Your Luxury Home Loan</w:t>
+        <w:t>Work With Tyler Henschel on Your Luxury Home Loan</w:t>
       </w:r>
     </w:p>
     <w:p>
       <w:r>
-        <w:t>Tyler Herschel is a Senior Loan Officer at CMG Home Loans (NMLS 2034073) serving the entire Greater Houston area, including Memorial, The Woodlands, Sugar Land, Bellaire, Pearland</w:t>
+        <w:t>Tyler Henschel is a Senior Loan Officer at CMG Home Loans (NMLS 2034073) serving the entire Greater Houston area, including Memorial, The Woodlands, Sugar Land, Bellaire, Pearland</w:t>
       </w:r>
     </w:p>
     <w:sectPr>

</xml_diff>